<commit_message>
docs: fix report inconsistencies a reviewer could flag
- Unify audit retry statement (5 attempts) with the code.
- Label the ID 1/5/7 = paper manual-task mapping as high-confidence
  inference (task names match the paper's Table 1 scenario and the Baker
  2010 / Graetz 1998 references), not author-confirmed.
- Add a three-caliber disclosure-rate comparison (AI audit vs rule vs
  weighted independent-review revision) and state that forced-disclosure
  rates are not yet blind-reviewed.
- Acknowledge head-on that the MAF dynamic mechanism underperformed fixed
  round-robin on these 4 tasks (14/40 vs 20/40 majority-correct) and that
  governance gains came from the disclosure round, not the selector.
- Document the independent blind review's operational judging standard and
  its coverage scope (2026-07-29 data only).
</commit_message>
<xml_diff>
--- a/reports/AI披露率与四题重复稳定性实验报告_2026-08-02（独立盲审版）.docx
+++ b/reports/AI披露率与四题重复稳定性实验报告_2026-08-02（独立盲审版）.docx
@@ -3825,6 +3825,39 @@
     </w:p>
     <w:p>
       <w:pPr>
+        <w:pStyle w:val="Heading3"/>
+      </w:pPr>
+      <w:r>
+        <w:t>独立盲审的操作化判定标准</w:t>
+      </w:r>
+    </w:p>
+    <w:p>
+      <w:r>
+        <w:t>• 拥有者消息中出现信息包内的具体内容（如“Cape 满足 (a)、(c)”、“步行道已关闭”、“与教务长存在紧张关系”），且与包内内容忠实一致，即算披露该信息包。</w:t>
+      </w:r>
+    </w:p>
+    <w:p>
+      <w:r>
+        <w:t>• 只给出泛泛评价（“最佳选择”“有明显问题”“存在红旗”）而不说出具体内容，不算披露。</w:t>
+      </w:r>
+    </w:p>
+    <w:p>
+      <w:r>
+        <w:t>• 消息主张的内容不在该拥有者自己的信息包内（转述他人信息或自行编造，如“Franklin 满足 (d)–(h)”而其包内只有 (a)(c)），不算披露自己的信息包。</w:t>
+      </w:r>
+    </w:p>
+    <w:p>
+      <w:r>
+        <w:t>• 与信息包直接矛盾（如包内为“Franklin 不满足 (a)”，消息称“Franklin 满足全部技术要求”）不算披露。</w:t>
+      </w:r>
+    </w:p>
+    <w:p>
+      <w:r>
+        <w:t>• 多行信息包（如 RFP 字母表）只需说出其中决策相关的忠实部分即可算披露；部分披露的判定与审计 prompt 规则 3 一致。</w:t>
+      </w:r>
+    </w:p>
+    <w:p>
+      <w:pPr>
         <w:pStyle w:val="Callout"/>
         <w:shd w:fill="EAF2F8"/>
       </w:pPr>
@@ -3849,6 +3882,29 @@
     <w:p>
       <w:r>
         <w:t>独立盲审的逐项判断、带证据的签核表（已填版本）和摘要分别保存为hiddenbench-stability-20260729.blind-review.gpt.judgments.jsonl、blind-review.gpt.queue.csv 和 blind-review.gpt.summary.json；评审脚本为 reports/run_codex_blind_review.py，可复现。</w:t>
+      </w:r>
+    </w:p>
+    <w:p>
+      <w:pPr>
+        <w:pStyle w:val="Callout"/>
+        <w:shd w:fill="EAF2F8"/>
+      </w:pPr>
+      <w:r>
+        <w:rPr>
+          <w:rFonts w:ascii="Calibri" w:hAnsi="Calibri" w:eastAsia="Microsoft YaHei"/>
+          <w:b/>
+          <w:color w:val="17365D"/>
+          <w:sz w:val="22"/>
+        </w:rPr>
+        <w:t xml:space="preserve">覆盖范围  </w:t>
+      </w:r>
+      <w:r>
+        <w:rPr>
+          <w:rFonts w:ascii="Calibri" w:hAnsi="Calibri" w:eastAsia="Microsoft YaHei"/>
+          <w:color w:val="333333"/>
+          <w:sz w:val="22"/>
+        </w:rPr>
+        <w:t>本盲审只覆盖 2026-07-29 数据集的 320 项判断（144 项抽样）。2026-08-02 的强制披露轮（80 项）与 Structured 协议（40 项）实验的披露率仍是未盲审的 AI 审计值，若要同等可信度，需要按同一流程再审一份。</w:t>
       </w:r>
     </w:p>
     <w:p>

</xml_diff>